<commit_message>
subiendo la segunda tarea
</commit_message>
<xml_diff>
--- a/src/Analisis_Arquitectura_Software_TikTok.docx
+++ b/src/Analisis_Arquitectura_Software_TikTok.docx
@@ -427,65 +427,25 @@
           <w:sz w:val="24"/>
           <w:szCs w:val="24"/>
         </w:rPr>
-        <w:t xml:space="preserve">TikTok es </w:t>
+        <w:t>TikTok es una plataforma global de video corto propiedad de ByteDance. Desde el punto de vista de arquitectura de software, su principal desafío no consiste únicamente en almacenar y reproducir videos, sino en atender enormes volúmenes de tráfico, personalizar el contenido con baja latencia, procesar interacciones sociales en tiempo casi real y mantener alta disponibilidad en múltiples regiones. Por ello, el análisis arquitectónico debe considerar simultáneamente escalabilidad, rendimiento, resiliencia, distribución de datos, seguridad y evolución independiente de servicios.</w:t>
       </w:r>
+    </w:p>
+    <w:p>
+      <w:pPr>
+        <w:jc w:val="both"/>
+        <w:rPr>
+          <w:rFonts w:ascii="Times New Roman" w:hAnsi="Times New Roman" w:cs="Times New Roman"/>
+          <w:sz w:val="24"/>
+          <w:szCs w:val="24"/>
+        </w:rPr>
+      </w:pPr>
       <w:r>
         <w:rPr>
           <w:rFonts w:ascii="Times New Roman" w:hAnsi="Times New Roman" w:cs="Times New Roman"/>
           <w:sz w:val="24"/>
           <w:szCs w:val="24"/>
         </w:rPr>
-        <w:t>una plataforma global de video corto propiedad de ByteDance. Desde el punto de vista de arquitectura de software, su principal desafío no consiste únicamente en almacenar y reproducir videos, sino en atender enormes volúmenes de tráfico, personalizar el co</w:t>
-      </w:r>
-      <w:r>
-        <w:rPr>
-          <w:rFonts w:ascii="Times New Roman" w:hAnsi="Times New Roman" w:cs="Times New Roman"/>
-          <w:sz w:val="24"/>
-          <w:szCs w:val="24"/>
-        </w:rPr>
-        <w:t xml:space="preserve">ntenido con baja latencia, procesar interacciones sociales en tiempo casi real y mantener alta disponibilidad en múltiples regiones. Por ello, el análisis arquitectónico debe considerar simultáneamente escalabilidad, rendimiento, resiliencia, distribución </w:t>
-      </w:r>
-      <w:r>
-        <w:rPr>
-          <w:rFonts w:ascii="Times New Roman" w:hAnsi="Times New Roman" w:cs="Times New Roman"/>
-          <w:sz w:val="24"/>
-          <w:szCs w:val="24"/>
-        </w:rPr>
-        <w:t>de datos, seguridad y evolución independiente de servicios.</w:t>
-      </w:r>
-    </w:p>
-    <w:p>
-      <w:pPr>
-        <w:jc w:val="both"/>
-        <w:rPr>
-          <w:rFonts w:ascii="Times New Roman" w:hAnsi="Times New Roman" w:cs="Times New Roman"/>
-          <w:sz w:val="24"/>
-          <w:szCs w:val="24"/>
-        </w:rPr>
-      </w:pPr>
-      <w:r>
-        <w:rPr>
-          <w:rFonts w:ascii="Times New Roman" w:hAnsi="Times New Roman" w:cs="Times New Roman"/>
-          <w:sz w:val="24"/>
-          <w:szCs w:val="24"/>
-        </w:rPr>
-        <w:t>ByteDance no publica un diagrama completo y oficial de la arquitectura interna de TikTok. En consecuencia, este documento combina evidencia técnica pública de ByteDance con una interpretación arqu</w:t>
-      </w:r>
-      <w:r>
-        <w:rPr>
-          <w:rFonts w:ascii="Times New Roman" w:hAnsi="Times New Roman" w:cs="Times New Roman"/>
-          <w:sz w:val="24"/>
-          <w:szCs w:val="24"/>
-        </w:rPr>
-        <w:t>itectónica razonable. Cuando se mencionan componentes como gateway, servicios de feed, almacenamiento de objetos o mensajería, se presentan como una vista lógica simplificada coherente con las prácticas documentadas por ByteDance y con los requisitos de un</w:t>
-      </w:r>
-      <w:r>
-        <w:rPr>
-          <w:rFonts w:ascii="Times New Roman" w:hAnsi="Times New Roman" w:cs="Times New Roman"/>
-          <w:sz w:val="24"/>
-          <w:szCs w:val="24"/>
-        </w:rPr>
-        <w:t>a plataforma de esta escala, no como una reproducción exacta de infraestructura confidencial.</w:t>
+        <w:t>ByteDance no publica un diagrama completo y oficial de la arquitectura interna de TikTok. En consecuencia, este documento combina evidencia técnica pública de ByteDance con una interpretación arquitectónica razonable. Cuando se mencionan componentes como gateway, servicios de feed, almacenamiento de objetos o mensajería, se presentan como una vista lógica simplificada coherente con las prácticas documentadas por ByteDance y con los requisitos de una plataforma de esta escala, no como una reproducción exacta de infraestructura confidencial.</w:t>
       </w:r>
     </w:p>
     <w:p>
@@ -523,23 +483,7 @@
           <w:sz w:val="24"/>
           <w:szCs w:val="24"/>
         </w:rPr>
-        <w:t>Analizar la arquitectura de software de TikTok desde una perspectiva profesional, identificando el estilo arquitectónico dominante, sus p</w:t>
-      </w:r>
-      <w:r>
-        <w:rPr>
-          <w:rFonts w:ascii="Times New Roman" w:hAnsi="Times New Roman" w:cs="Times New Roman"/>
-          <w:sz w:val="24"/>
-          <w:szCs w:val="24"/>
-        </w:rPr>
-        <w:t>rincipales componentes lógicos, mecanismos de comunicación, gestión de datos, decisiones de escalabilidad y atributos de calidad. Asimismo, se busca explicar por qué una arquitectura distribuida basada en microservicios resulta adecuada para un sistema mun</w:t>
-      </w:r>
-      <w:r>
-        <w:rPr>
-          <w:rFonts w:ascii="Times New Roman" w:hAnsi="Times New Roman" w:cs="Times New Roman"/>
-          <w:sz w:val="24"/>
-          <w:szCs w:val="24"/>
-        </w:rPr>
-        <w:t>dial de contenido multimedia y recomendación personalizada.</w:t>
+        <w:t>Analizar la arquitectura de software de TikTok desde una perspectiva profesional, identificando el estilo arquitectónico dominante, sus principales componentes lógicos, mecanismos de comunicación, gestión de datos, decisiones de escalabilidad y atributos de calidad. Asimismo, se busca explicar por qué una arquitectura distribuida basada en microservicios resulta adecuada para un sistema mundial de contenido multimedia y recomendación personalizada.</w:t>
       </w:r>
     </w:p>
     <w:p>
@@ -597,7 +541,16 @@
           <w:sz w:val="24"/>
           <w:szCs w:val="24"/>
         </w:rPr>
-        <w:t>La evidencia pública de ByteDance muestra un fuerte uso de arquitecturas de microservicios y tecnologías cloud-</w:t>
+        <w:t xml:space="preserve">La evidencia pública de ByteDance muestra un fuerte uso de arquitecturas de microservicios y tecnologías cloud-native. Su proyecto CloudWeGo está orientado específicamente a la construcción de microservicios empresariales de alto rendimiento, escalabilidad y confiabilidad. Además, publicaciones técnicas de ByteDance describen tráfico REST y RPC entre servicios y entornos de software de gran escala. Por ello, la clasificación más adecuada para TikTok a nivel macro es una </w:t>
+      </w:r>
+      <w:r>
+        <w:rPr>
+          <w:rFonts w:ascii="Times New Roman" w:hAnsi="Times New Roman" w:cs="Times New Roman"/>
+          <w:sz w:val="24"/>
+          <w:szCs w:val="24"/>
+          <w:highlight w:val="yellow"/>
+        </w:rPr>
+        <w:t>arquitectura distribuida basada en microservicios</w:t>
       </w:r>
       <w:r>
         <w:rPr>
@@ -605,15 +558,7 @@
           <w:sz w:val="24"/>
           <w:szCs w:val="24"/>
         </w:rPr>
-        <w:t>native. Su proyecto CloudWeGo está orientado específicamente a la construcción de microservicios empresariales de alto rendimiento, escalabilidad y confiabilidad. Además, publicaciones técnicas de ByteDance describen tráfico REST y RPC entre servicios y en</w:t>
-      </w:r>
-      <w:r>
-        <w:rPr>
-          <w:rFonts w:ascii="Times New Roman" w:hAnsi="Times New Roman" w:cs="Times New Roman"/>
-          <w:sz w:val="24"/>
-          <w:szCs w:val="24"/>
-        </w:rPr>
-        <w:t xml:space="preserve">tornos de software de gran escala. Por ello, la clasificación más adecuada para TikTok a nivel macro es una arquitectura distribuida basada en microservicios, complementada por procesamiento orientado </w:t>
+        <w:t xml:space="preserve">, complementada por procesamiento orientado </w:t>
       </w:r>
       <w:proofErr w:type="gramStart"/>
       <w:r>
@@ -649,23 +594,7 @@
           <w:sz w:val="24"/>
           <w:szCs w:val="24"/>
         </w:rPr>
-        <w:t>En este m</w:t>
-      </w:r>
-      <w:r>
-        <w:rPr>
-          <w:rFonts w:ascii="Times New Roman" w:hAnsi="Times New Roman" w:cs="Times New Roman"/>
-          <w:sz w:val="24"/>
-          <w:szCs w:val="24"/>
-        </w:rPr>
-        <w:t>odelo, funcionalidades de negocio que en un monolito vivirían en una sola aplicación pueden evolucionar como servicios independientes: identidad, perfiles, carga de videos, metadatos, feed, recomendaciones, comentarios, likes, búsqueda, mensajería y notifi</w:t>
-      </w:r>
-      <w:r>
-        <w:rPr>
-          <w:rFonts w:ascii="Times New Roman" w:hAnsi="Times New Roman" w:cs="Times New Roman"/>
-          <w:sz w:val="24"/>
-          <w:szCs w:val="24"/>
-        </w:rPr>
-        <w:t>caciones. Esta separación permite desplegar, escalar y modificar partes del sistema sin tener que publicar toda la plataforma de forma conjunta.</w:t>
+        <w:t>En este modelo, funcionalidades de negocio que en un monolito vivirían en una sola aplicación pueden evolucionar como servicios independientes: identidad, perfiles, carga de videos, metadatos, feed, recomendaciones, comentarios, likes, búsqueda, mensajería y notificaciones. Esta separación permite desplegar, escalar y modificar partes del sistema sin tener que publicar toda la plataforma de forma conjunta.</w:t>
       </w:r>
     </w:p>
     <w:p>
@@ -723,15 +652,7 @@
           <w:sz w:val="24"/>
           <w:szCs w:val="24"/>
         </w:rPr>
-        <w:t>Las interacciones de TikTok generan eventos de manera con</w:t>
-      </w:r>
-      <w:r>
-        <w:rPr>
-          <w:rFonts w:ascii="Times New Roman" w:hAnsi="Times New Roman" w:cs="Times New Roman"/>
-          <w:sz w:val="24"/>
-          <w:szCs w:val="24"/>
-        </w:rPr>
-        <w:t xml:space="preserve">tinua: un usuario visualiza un video, lo reproduce durante cierto tiempo, da un like, comenta, comparte o sigue una cuenta. </w:t>
+        <w:t xml:space="preserve">Las interacciones de TikTok generan eventos de manera continua: un usuario visualiza un video, lo reproduce durante cierto tiempo, da un like, comenta, comparte o sigue una cuenta. </w:t>
       </w:r>
       <w:r>
         <w:rPr>
@@ -740,15 +661,7 @@
           <w:szCs w:val="24"/>
         </w:rPr>
         <w:lastRenderedPageBreak/>
-        <w:t>Arquitectónicamente, estas acciones son buenos candidatos para mensajería asíncrona. Un evento puede ser consumido por varios compon</w:t>
-      </w:r>
-      <w:r>
-        <w:rPr>
-          <w:rFonts w:ascii="Times New Roman" w:hAnsi="Times New Roman" w:cs="Times New Roman"/>
-          <w:sz w:val="24"/>
-          <w:szCs w:val="24"/>
-        </w:rPr>
-        <w:t>entes sin bloquear la respuesta principal: analítica, recomendación, notificaciones, moderación o actualización de contadores. ByteDance también publica sistemas que utilizan Kafka, lo que demuestra experiencia interna con este patrón de integración.</w:t>
+        <w:t>Arquitectónicamente, estas acciones son buenos candidatos para mensajería asíncrona. Un evento puede ser consumido por varios componentes sin bloquear la respuesta principal: analítica, recomendación, notificaciones, moderación o actualización de contadores. ByteDance también publica sistemas que utilizan Kafka, lo que demuestra experiencia interna con este patrón de integración.</w:t>
       </w:r>
     </w:p>
     <w:p>
@@ -786,15 +699,7 @@
           <w:sz w:val="24"/>
           <w:szCs w:val="24"/>
         </w:rPr>
-        <w:t>ByteDance desarrolla KubeWharf, un conjunto de componentes construidos sobre Kubernetes para escenarios de gran escala, y sus ofertas técnicas hacen referencia a Kubernetes, service mesh y microservicios. Esto es consistente</w:t>
-      </w:r>
-      <w:r>
-        <w:rPr>
-          <w:rFonts w:ascii="Times New Roman" w:hAnsi="Times New Roman" w:cs="Times New Roman"/>
-          <w:sz w:val="24"/>
-          <w:szCs w:val="24"/>
-        </w:rPr>
-        <w:t xml:space="preserve"> con una operación basada en contenedores, descubrimiento de servicios, balanceo, autoescalado, observabilidad y despliegues automatizados.</w:t>
+        <w:t>ByteDance desarrolla KubeWharf, un conjunto de componentes construidos sobre Kubernetes para escenarios de gran escala, y sus ofertas técnicas hacen referencia a Kubernetes, service mesh y microservicios. Esto es consistente con una operación basada en contenedores, descubrimiento de servicios, balanceo, autoescalado, observabilidad y despliegues automatizados.</w:t>
       </w:r>
     </w:p>
     <w:p>
@@ -886,16 +791,7 @@
           <w:sz w:val="24"/>
           <w:szCs w:val="24"/>
         </w:rPr>
-        <w:t>Figura 1. Vista lógica simplificada e inferida de la arquitectura de TikTok/Byt</w:t>
-      </w:r>
-      <w:r>
-        <w:rPr>
-          <w:rFonts w:ascii="Times New Roman" w:hAnsi="Times New Roman" w:cs="Times New Roman"/>
-          <w:i/>
-          <w:sz w:val="24"/>
-          <w:szCs w:val="24"/>
-        </w:rPr>
-        <w:t>eDance.</w:t>
+        <w:t>Figura 1. Vista lógica simplificada e inferida de la arquitectura de TikTok/ByteDance.</w:t>
       </w:r>
     </w:p>
     <w:p>
@@ -933,15 +829,7 @@
           <w:sz w:val="24"/>
           <w:szCs w:val="24"/>
         </w:rPr>
-        <w:t>Incluye principalmente las aplicaciones móviles y las interfaces web. Esta capa captura interacciones del usuario y solicita contenido, perfiles, comentarios, búsquedas y operaciones de publicación. El cliente debe minimizar latenc</w:t>
-      </w:r>
-      <w:r>
-        <w:rPr>
-          <w:rFonts w:ascii="Times New Roman" w:hAnsi="Times New Roman" w:cs="Times New Roman"/>
-          <w:sz w:val="24"/>
-          <w:szCs w:val="24"/>
-        </w:rPr>
-        <w:t>ia percibida, realizar precarga de contenido y adaptarse a condiciones variables de red.</w:t>
+        <w:t>Incluye principalmente las aplicaciones móviles y las interfaces web. Esta capa captura interacciones del usuario y solicita contenido, perfiles, comentarios, búsquedas y operaciones de publicación. El cliente debe minimizar latencia percibida, realizar precarga de contenido y adaptarse a condiciones variables de red.</w:t>
       </w:r>
     </w:p>
     <w:p>
@@ -979,15 +867,7 @@
           <w:sz w:val="24"/>
           <w:szCs w:val="24"/>
         </w:rPr>
-        <w:t xml:space="preserve">El video requiere una estrategia de distribución cercana al usuario. Una CDN o infraestructura edge permite servir segmentos </w:t>
-      </w:r>
-      <w:r>
-        <w:rPr>
-          <w:rFonts w:ascii="Times New Roman" w:hAnsi="Times New Roman" w:cs="Times New Roman"/>
-          <w:sz w:val="24"/>
-          <w:szCs w:val="24"/>
-        </w:rPr>
-        <w:t xml:space="preserve">multimedia desde ubicaciones próximas, reduciendo latencia y </w:t>
+        <w:t xml:space="preserve">El video requiere una estrategia de distribución cercana al usuario. Una CDN o infraestructura edge permite servir segmentos multimedia desde ubicaciones próximas, reduciendo latencia y </w:t>
       </w:r>
       <w:r>
         <w:rPr>
@@ -996,15 +876,7 @@
           <w:szCs w:val="24"/>
         </w:rPr>
         <w:lastRenderedPageBreak/>
-        <w:t>carga sobre los centros de datos principales. La política pública de peering de ByteDance confirma una operación de red propia con requisitos de capacidad y redundancia, lo cual es consistente co</w:t>
-      </w:r>
-      <w:r>
-        <w:rPr>
-          <w:rFonts w:ascii="Times New Roman" w:hAnsi="Times New Roman" w:cs="Times New Roman"/>
-          <w:sz w:val="24"/>
-          <w:szCs w:val="24"/>
-        </w:rPr>
-        <w:t>n una plataforma intensiva en tráfico audiovisual.</w:t>
+        <w:t>carga sobre los centros de datos principales. La política pública de peering de ByteDance confirma una operación de red propia con requisitos de capacidad y redundancia, lo cual es consistente con una plataforma intensiva en tráfico audiovisual.</w:t>
       </w:r>
     </w:p>
     <w:p>
@@ -1060,15 +932,7 @@
           <w:sz w:val="24"/>
           <w:szCs w:val="24"/>
         </w:rPr>
-        <w:t xml:space="preserve"> abuso y agregación de respuestas. Detrás de ella, la</w:t>
-      </w:r>
-      <w:r>
-        <w:rPr>
-          <w:rFonts w:ascii="Times New Roman" w:hAnsi="Times New Roman" w:cs="Times New Roman"/>
-          <w:sz w:val="24"/>
-          <w:szCs w:val="24"/>
-        </w:rPr>
-        <w:t>s solicitudes se encaminan hacia microservicios especializados mediante HTTP/REST o RPC. Publicaciones de ByteDance describen explícitamente tráfico RESTful y RPC, por lo que RPC es especialmente relevante para comunicación interna de baja latencia.</w:t>
+        <w:t xml:space="preserve"> abuso y agregación de respuestas. Detrás de ella, las solicitudes se encaminan hacia microservicios especializados mediante HTTP/REST o RPC. Publicaciones de ByteDance describen explícitamente tráfico RESTful y RPC, por lo que RPC es especialmente relevante para comunicación interna de baja latencia.</w:t>
       </w:r>
     </w:p>
     <w:p>
@@ -1088,16 +952,7 @@
           <w:sz w:val="24"/>
           <w:szCs w:val="24"/>
         </w:rPr>
-        <w:t>4.4 Se</w:t>
-      </w:r>
-      <w:r>
-        <w:rPr>
-          <w:rFonts w:ascii="Times New Roman" w:hAnsi="Times New Roman" w:cs="Times New Roman"/>
-          <w:color w:val="auto"/>
-          <w:sz w:val="24"/>
-          <w:szCs w:val="24"/>
-        </w:rPr>
-        <w:t>rvicios de negocio</w:t>
+        <w:t>4.4 Servicios de negocio</w:t>
       </w:r>
     </w:p>
     <w:p>
@@ -1154,15 +1009,7 @@
           <w:sz w:val="24"/>
           <w:szCs w:val="24"/>
         </w:rPr>
-        <w:t>Servicio de video y med</w:t>
-      </w:r>
-      <w:r>
-        <w:rPr>
-          <w:rFonts w:ascii="Times New Roman" w:hAnsi="Times New Roman" w:cs="Times New Roman"/>
-          <w:sz w:val="24"/>
-          <w:szCs w:val="24"/>
-        </w:rPr>
-        <w:t>ia: carga, validación, procesamiento, transcodificación, miniaturas, metadatos y publicación.</w:t>
+        <w:t>Servicio de video y media: carga, validación, procesamiento, transcodificación, miniaturas, metadatos y publicación.</w:t>
       </w:r>
     </w:p>
     <w:p>
@@ -1200,15 +1047,7 @@
           <w:sz w:val="24"/>
           <w:szCs w:val="24"/>
         </w:rPr>
-        <w:t>Búsqueda y descubrimiento: indexación de cuentas, hashtags, son</w:t>
-      </w:r>
-      <w:r>
-        <w:rPr>
-          <w:rFonts w:ascii="Times New Roman" w:hAnsi="Times New Roman" w:cs="Times New Roman"/>
-          <w:sz w:val="24"/>
-          <w:szCs w:val="24"/>
-        </w:rPr>
-        <w:t>idos, videos y tendencias.</w:t>
+        <w:t>Búsqueda y descubrimiento: indexación de cuentas, hashtags, sonidos, videos y tendencias.</w:t>
       </w:r>
     </w:p>
     <w:p>
@@ -1265,31 +1104,7 @@
           <w:sz w:val="24"/>
           <w:szCs w:val="24"/>
         </w:rPr>
-        <w:t>Un sistema de esta naturaleza no depende razonablemente de una única base de datos. Diferentes nece</w:t>
-      </w:r>
-      <w:r>
-        <w:rPr>
-          <w:rFonts w:ascii="Times New Roman" w:hAnsi="Times New Roman" w:cs="Times New Roman"/>
-          <w:sz w:val="24"/>
-          <w:szCs w:val="24"/>
-        </w:rPr>
-        <w:t xml:space="preserve">sidades requieren tecnologías distintas: almacenamiento de objetos para archivos multimedia; bases de datos distribuidas o NoSQL para grandes volúmenes de metadatos y relaciones; cachés distribuidas para datos de acceso frecuente; motores de búsqueda para </w:t>
-      </w:r>
-      <w:r>
-        <w:rPr>
-          <w:rFonts w:ascii="Times New Roman" w:hAnsi="Times New Roman" w:cs="Times New Roman"/>
-          <w:sz w:val="24"/>
-          <w:szCs w:val="24"/>
-        </w:rPr>
-        <w:t>indexación; y sistemas de streaming o colas para eventos. ByteDance publica puestos y proyectos relacionados con bases NoSQL distribuidas, caches, key-value stores, motores de búsqueda y sistemas cloud-native, lo que respalda este enfoque de persistencia p</w:t>
-      </w:r>
-      <w:r>
-        <w:rPr>
-          <w:rFonts w:ascii="Times New Roman" w:hAnsi="Times New Roman" w:cs="Times New Roman"/>
-          <w:sz w:val="24"/>
-          <w:szCs w:val="24"/>
-        </w:rPr>
-        <w:t>olíglota.</w:t>
+        <w:t>Un sistema de esta naturaleza no depende razonablemente de una única base de datos. Diferentes necesidades requieren tecnologías distintas: almacenamiento de objetos para archivos multimedia; bases de datos distribuidas o NoSQL para grandes volúmenes de metadatos y relaciones; cachés distribuidas para datos de acceso frecuente; motores de búsqueda para indexación; y sistemas de streaming o colas para eventos. ByteDance publica puestos y proyectos relacionados con bases NoSQL distribuidas, caches, key-value stores, motores de búsqueda y sistemas cloud-native, lo que respalda este enfoque de persistencia políglota.</w:t>
       </w:r>
     </w:p>
     <w:p>
@@ -1372,16 +1187,7 @@
                 <w:sz w:val="24"/>
                 <w:szCs w:val="24"/>
               </w:rPr>
-              <w:t>Decisión arq</w:t>
-            </w:r>
-            <w:r>
-              <w:rPr>
-                <w:rFonts w:ascii="Times New Roman" w:hAnsi="Times New Roman" w:cs="Times New Roman"/>
-                <w:b/>
-                <w:sz w:val="24"/>
-                <w:szCs w:val="24"/>
-              </w:rPr>
-              <w:t>uitectónica</w:t>
+              <w:t>Decisión arquitectónica</w:t>
             </w:r>
           </w:p>
         </w:tc>
@@ -1602,7 +1408,7 @@
                 <w:sz w:val="24"/>
                 <w:szCs w:val="24"/>
               </w:rPr>
-              <w:t xml:space="preserve">CDN, caché, RPC y </w:t>
+              <w:t xml:space="preserve">CDN, caché, RPC y procesamiento cercano al </w:t>
             </w:r>
             <w:r>
               <w:rPr>
@@ -1611,7 +1417,7 @@
                 <w:szCs w:val="24"/>
               </w:rPr>
               <w:lastRenderedPageBreak/>
-              <w:t>procesamiento cercano al usuario</w:t>
+              <w:t>usuario</w:t>
             </w:r>
           </w:p>
         </w:tc>
@@ -1634,16 +1440,7 @@
                 <w:szCs w:val="24"/>
               </w:rPr>
               <w:lastRenderedPageBreak/>
-              <w:t xml:space="preserve">Disminuir latencia y tráfico al </w:t>
-            </w:r>
-            <w:r>
-              <w:rPr>
-                <w:rFonts w:ascii="Times New Roman" w:hAnsi="Times New Roman" w:cs="Times New Roman"/>
-                <w:sz w:val="24"/>
-                <w:szCs w:val="24"/>
-              </w:rPr>
-              <w:lastRenderedPageBreak/>
-              <w:t>núcleo.</w:t>
+              <w:t>Disminuir latencia y tráfico al núcleo.</w:t>
             </w:r>
           </w:p>
         </w:tc>
@@ -1671,7 +1468,6 @@
                 <w:sz w:val="24"/>
                 <w:szCs w:val="24"/>
               </w:rPr>
-              <w:lastRenderedPageBreak/>
               <w:t>Modificabilidad</w:t>
             </w:r>
             <w:proofErr w:type="spellEnd"/>
@@ -1959,16 +1755,7 @@
           <w:sz w:val="24"/>
           <w:szCs w:val="24"/>
         </w:rPr>
-        <w:t>8. Ventajas de esta arquitectura p</w:t>
-      </w:r>
-      <w:r>
-        <w:rPr>
-          <w:rFonts w:ascii="Times New Roman" w:hAnsi="Times New Roman" w:cs="Times New Roman"/>
-          <w:color w:val="auto"/>
-          <w:sz w:val="24"/>
-          <w:szCs w:val="24"/>
-        </w:rPr>
-        <w:t>ara TikTok</w:t>
+        <w:t>8. Ventajas de esta arquitectura para TikTok</w:t>
       </w:r>
     </w:p>
     <w:p>
@@ -2006,15 +1793,7 @@
           <w:sz w:val="24"/>
           <w:szCs w:val="24"/>
         </w:rPr>
-        <w:t xml:space="preserve">Despliegues independientes: equipos diferentes pueden evolucionar </w:t>
-      </w:r>
-      <w:r>
-        <w:rPr>
-          <w:rFonts w:ascii="Times New Roman" w:hAnsi="Times New Roman" w:cs="Times New Roman"/>
-          <w:sz w:val="24"/>
-          <w:szCs w:val="24"/>
-        </w:rPr>
-        <w:t>servicios con menor coordinación que en un monolito gigante.</w:t>
+        <w:t>Despliegues independientes: equipos diferentes pueden evolucionar servicios con menor coordinación que en un monolito gigante.</w:t>
       </w:r>
     </w:p>
     <w:p>
@@ -2052,15 +1831,7 @@
           <w:sz w:val="24"/>
           <w:szCs w:val="24"/>
         </w:rPr>
-        <w:t>Especialización tecnológica: cada dominio puede utilizar el almacenamiento o mecanismo de co</w:t>
-      </w:r>
-      <w:r>
-        <w:rPr>
-          <w:rFonts w:ascii="Times New Roman" w:hAnsi="Times New Roman" w:cs="Times New Roman"/>
-          <w:sz w:val="24"/>
-          <w:szCs w:val="24"/>
-        </w:rPr>
-        <w:t>municación más apropiado.</w:t>
+        <w:t>Especialización tecnológica: cada dominio puede utilizar el almacenamiento o mecanismo de comunicación más apropiado.</w:t>
       </w:r>
     </w:p>
     <w:p>
@@ -2118,15 +1889,7 @@
           <w:sz w:val="24"/>
           <w:szCs w:val="24"/>
         </w:rPr>
-        <w:t>Complejidad operacional elevada: cientos o miles de servicios requieren descubri</w:t>
-      </w:r>
-      <w:r>
-        <w:rPr>
-          <w:rFonts w:ascii="Times New Roman" w:hAnsi="Times New Roman" w:cs="Times New Roman"/>
-          <w:sz w:val="24"/>
-          <w:szCs w:val="24"/>
-        </w:rPr>
-        <w:t>miento, configuración, observabilidad, automatización y gobierno.</w:t>
+        <w:t>Complejidad operacional elevada: cientos o miles de servicios requieren descubrimiento, configuración, observabilidad, automatización y gobierno.</w:t>
       </w:r>
     </w:p>
     <w:p>
@@ -2164,15 +1927,7 @@
           <w:sz w:val="24"/>
           <w:szCs w:val="24"/>
         </w:rPr>
-        <w:t xml:space="preserve">Fallas de red: una llamada remota puede fallar o tardar; </w:t>
-      </w:r>
-      <w:r>
-        <w:rPr>
-          <w:rFonts w:ascii="Times New Roman" w:hAnsi="Times New Roman" w:cs="Times New Roman"/>
-          <w:sz w:val="24"/>
-          <w:szCs w:val="24"/>
-        </w:rPr>
-        <w:t>se requieren timeouts, reintentos, circuit breakers e idempotencia.</w:t>
+        <w:t>Fallas de red: una llamada remota puede fallar o tardar; se requieren timeouts, reintentos, circuit breakers e idempotencia.</w:t>
       </w:r>
     </w:p>
     <w:p>
@@ -2210,15 +1965,7 @@
           <w:sz w:val="24"/>
           <w:szCs w:val="24"/>
         </w:rPr>
-        <w:t>Costos de datos y red: el video, la replicación global y</w:t>
-      </w:r>
-      <w:r>
-        <w:rPr>
-          <w:rFonts w:ascii="Times New Roman" w:hAnsi="Times New Roman" w:cs="Times New Roman"/>
-          <w:sz w:val="24"/>
-          <w:szCs w:val="24"/>
-        </w:rPr>
-        <w:t xml:space="preserve"> el procesamiento de eventos demandan infraestructura considerable.</w:t>
+        <w:t>Costos de datos y red: el video, la replicación global y el procesamiento de eventos demandan infraestructura considerable.</w:t>
       </w:r>
     </w:p>
     <w:p>
@@ -2851,11 +2598,6 @@
     <w:lsdException w:name="Book Title" w:uiPriority="33" w:qFormat="1"/>
     <w:lsdException w:name="Bibliography" w:semiHidden="1" w:uiPriority="37" w:unhideWhenUsed="1"/>
     <w:lsdException w:name="TOC Heading" w:semiHidden="1" w:uiPriority="39" w:unhideWhenUsed="1" w:qFormat="1"/>
-    <w:lsdException w:name="Plain Table 5" w:semiHidden="1" w:unhideWhenUsed="1"/>
-    <w:lsdException w:name="Grid Table Light" w:semiHidden="1" w:unhideWhenUsed="1"/>
-    <w:lsdException w:name="Grid Table 1 Light" w:semiHidden="1" w:unhideWhenUsed="1"/>
-    <w:lsdException w:name="Grid Table 2" w:semiHidden="1" w:unhideWhenUsed="1"/>
-    <w:lsdException w:name="Grid Table 3" w:semiHidden="1" w:unhideWhenUsed="1"/>
     <w:lsdException w:name="Grid Table 4" w:uiPriority="49"/>
     <w:lsdException w:name="Grid Table 5 Dark" w:uiPriority="50"/>
     <w:lsdException w:name="Grid Table 6 Colorful" w:uiPriority="51"/>

</xml_diff>